<commit_message>
Add Appendix F (recruitment invitations) and G (Gantt chart); index appendices
- New: 08 Appendix F, recruitment invitations for women and for nurses
  and physiotherapists, English and Arabic.
- New: 09 Appendix G, 12-month Gantt chart aligned with protocol Section 11.
- Protocol: appendix list now names the exact file for each appendix;
  no items remain marked "to be attached".

Claude-Session: https://claude.ai/code/session_01Bi7sWUTrQGwtHL6n9ZVRo3
</commit_message>
<xml_diff>
--- a/ethics_submission/02_Research_Protocol_Form_1_Jouf_University.docx
+++ b/ethics_submission/02_Research_Protocol_Form_1_Jouf_University.docx
@@ -3942,7 +3942,7 @@
                 <w:sz w:val="20"/>
                 <w:szCs w:val="20"/>
               </w:rPr>
-              <w:t xml:space="preserve">Appendix A – Interview guide for women (English and Arabic versions in Documents 06 and 07).</w:t>
+              <w:t xml:space="preserve">Index of appendices.</w:t>
             </w:r>
             <w:r>
               <w:rPr>
@@ -3950,6 +3950,30 @@
                 <w:sz w:val="20"/>
                 <w:szCs w:val="20"/>
               </w:rPr>
+              <w:t xml:space="preserve"> Appendices A–C and E are reproduced in this protocol. Each appendix is also supplied as a separate file: Appendices A–C in Documents 06 (English) and 07 (Arabic); Appendix D in Documents 04 and 05; Appendix F in Document 08; Appendix G in Document 09.</w:t>
+            </w:r>
+          </w:p>
+          <w:p>
+            <w:pPr>
+              <w:bidi w:val="0"/>
+              <w:spacing w:before="0" w:after="80" w:line="252" w:lineRule="auto"/>
+              <w:jc w:val="left"/>
+            </w:pPr>
+            <w:r>
+              <w:rPr>
+                <w:rFonts w:ascii="Times New Roman" w:hAnsi="Times New Roman" w:cs="Times New Roman" w:eastAsia="Times New Roman"/>
+                <w:b/>
+                <w:sz w:val="20"/>
+                <w:szCs w:val="20"/>
+              </w:rPr>
+              <w:t xml:space="preserve">Appendix A – Interview guide for women (English and Arabic versions in Documents 06 and 07).</w:t>
+            </w:r>
+            <w:r>
+              <w:rPr>
+                <w:rFonts w:ascii="Times New Roman" w:hAnsi="Times New Roman" w:cs="Times New Roman" w:eastAsia="Times New Roman"/>
+                <w:sz w:val="20"/>
+                <w:szCs w:val="20"/>
+              </w:rPr>
               <w:t xml:space="preserve"> Introduction: thank the participant, restate that participation is voluntary and that she may pause or stop at any time.</w:t>
             </w:r>
           </w:p>
@@ -4339,7 +4363,7 @@
                 <w:sz w:val="20"/>
                 <w:szCs w:val="20"/>
               </w:rPr>
-              <w:t xml:space="preserve">Appendix D – Participant information and consent forms (Arabic and English).</w:t>
+              <w:t xml:space="preserve">Appendix D – Participant information and consent forms (English and Arabic).</w:t>
             </w:r>
             <w:r>
               <w:rPr>
@@ -4347,7 +4371,7 @@
                 <w:sz w:val="20"/>
                 <w:szCs w:val="20"/>
               </w:rPr>
-              <w:t xml:space="preserve"> Attached separately.</w:t>
+              <w:t xml:space="preserve"> Documents 04 (English) and 05 (Arabic).</w:t>
             </w:r>
           </w:p>
           <w:p>
@@ -4387,7 +4411,7 @@
                 <w:sz w:val="20"/>
                 <w:szCs w:val="20"/>
               </w:rPr>
-              <w:t xml:space="preserve">Appendix F – Recruitment invitations for women and professionals.</w:t>
+              <w:t xml:space="preserve">Appendix F – Recruitment invitations for women, and for nurses and physiotherapists (English and Arabic).</w:t>
             </w:r>
             <w:r>
               <w:rPr>
@@ -4395,16 +4419,23 @@
                 <w:sz w:val="20"/>
                 <w:szCs w:val="20"/>
               </w:rPr>
-              <w:t xml:space="preserve"> </w:t>
-            </w:r>
-            <w:r>
-              <w:rPr>
-                <w:rFonts w:ascii="Times New Roman" w:hAnsi="Times New Roman" w:cs="Times New Roman" w:eastAsia="Times New Roman"/>
+              <w:t xml:space="preserve"> Document 08.</w:t>
+            </w:r>
+          </w:p>
+          <w:p>
+            <w:pPr>
+              <w:bidi w:val="0"/>
+              <w:spacing w:before="0" w:after="80" w:line="252" w:lineRule="auto"/>
+              <w:jc w:val="left"/>
+            </w:pPr>
+            <w:r>
+              <w:rPr>
+                <w:rFonts w:ascii="Times New Roman" w:hAnsi="Times New Roman" w:cs="Times New Roman" w:eastAsia="Times New Roman"/>
+                <w:b/>
                 <w:sz w:val="20"/>
                 <w:szCs w:val="20"/>
-                <w:highlight w:val="yellow"/>
-              </w:rPr>
-              <w:t xml:space="preserve">[To be attached]</w:t>
+              </w:rPr>
+              <w:t xml:space="preserve">Appendix G – Gantt chart (12-month timeline).</w:t>
             </w:r>
             <w:r>
               <w:rPr>
@@ -4412,48 +4443,7 @@
                 <w:sz w:val="20"/>
                 <w:szCs w:val="20"/>
               </w:rPr>
-              <w:t xml:space="preserve">.</w:t>
-            </w:r>
-          </w:p>
-          <w:p>
-            <w:pPr>
-              <w:bidi w:val="0"/>
-              <w:spacing w:before="0" w:after="80" w:line="252" w:lineRule="auto"/>
-              <w:jc w:val="left"/>
-            </w:pPr>
-            <w:r>
-              <w:rPr>
-                <w:rFonts w:ascii="Times New Roman" w:hAnsi="Times New Roman" w:cs="Times New Roman" w:eastAsia="Times New Roman"/>
-                <w:b/>
-                <w:sz w:val="20"/>
-                <w:szCs w:val="20"/>
-              </w:rPr>
-              <w:t xml:space="preserve">Appendix G – Gantt chart.</w:t>
-            </w:r>
-            <w:r>
-              <w:rPr>
-                <w:rFonts w:ascii="Times New Roman" w:hAnsi="Times New Roman" w:cs="Times New Roman" w:eastAsia="Times New Roman"/>
-                <w:sz w:val="20"/>
-                <w:szCs w:val="20"/>
-              </w:rPr>
-              <w:t xml:space="preserve"> </w:t>
-            </w:r>
-            <w:r>
-              <w:rPr>
-                <w:rFonts w:ascii="Times New Roman" w:hAnsi="Times New Roman" w:cs="Times New Roman" w:eastAsia="Times New Roman"/>
-                <w:sz w:val="20"/>
-                <w:szCs w:val="20"/>
-                <w:highlight w:val="yellow"/>
-              </w:rPr>
-              <w:t xml:space="preserve">[To be attached]</w:t>
-            </w:r>
-            <w:r>
-              <w:rPr>
-                <w:rFonts w:ascii="Times New Roman" w:hAnsi="Times New Roman" w:cs="Times New Roman" w:eastAsia="Times New Roman"/>
-                <w:sz w:val="20"/>
-                <w:szCs w:val="20"/>
-              </w:rPr>
-              <w:t xml:space="preserve">.</w:t>
+              <w:t xml:space="preserve"> Document 09.</w:t>
             </w:r>
           </w:p>
         </w:tc>

</xml_diff>